<commit_message>
Add Level 5 lesson pages and slide decks for review.
Lesson pages, pictures, and 26-slide decks for Lessons 1–13 are on this branch. Listening audio is not recorded, and nothing here is published.
</commit_message>
<xml_diff>
--- a/level5/curriculum/Level5_Scope_and_Sequence.docx
+++ b/level5/curriculum/Level5_Scope_and_Sequence.docx
@@ -35,7 +35,7 @@
           <w:i w:val="0"/>
           <w:sz w:val="22"/>
         </w:rPr>
-        <w:t xml:space="preserve"> Draft plan for review (October 25, 2026). No Level 5 lesson book, slide deck, or listening file is published.</w:t>
+        <w:t xml:space="preserve"> Lesson pages and slide decks are on this branch for review (October 25, 2026). Listening audio is not recorded. Not published.</w:t>
       </w:r>
     </w:p>
     <w:p>
@@ -77,7 +77,7 @@
           <w:i w:val="0"/>
           <w:sz w:val="22"/>
         </w:rPr>
-        <w:t xml:space="preserve"> Program coordinators and the curriculum author (for review before any Level 5 lessons are built)</w:t>
+        <w:t xml:space="preserve"> Program coordinators and the curriculum author (for review before Level 5 is published)</w:t>
       </w:r>
     </w:p>
     <w:p>

</xml_diff>

<commit_message>
Publish Level 5 lessons, slides, audio, and site pages.
Lessons 1–13 now have listening audio, teacher PowerPoints, printable PDF and Word files, and Level 5 pages on the site.
</commit_message>
<xml_diff>
--- a/level5/curriculum/Level5_Scope_and_Sequence.docx
+++ b/level5/curriculum/Level5_Scope_and_Sequence.docx
@@ -35,7 +35,7 @@
           <w:i w:val="0"/>
           <w:sz w:val="22"/>
         </w:rPr>
-        <w:t xml:space="preserve"> Lesson pages and slide decks are on this branch for review (October 25, 2026). Listening audio is not recorded. Not published.</w:t>
+        <w:t xml:space="preserve"> Published (October 28, 2026). Lesson pages, slide decks, and listening audio for Lessons 1–13 are on the site.</w:t>
       </w:r>
     </w:p>
     <w:p>
@@ -77,7 +77,7 @@
           <w:i w:val="0"/>
           <w:sz w:val="22"/>
         </w:rPr>
-        <w:t xml:space="preserve"> Program coordinators and the curriculum author (for review before Level 5 is published)</w:t>
+        <w:t xml:space="preserve"> Program coordinators and volunteer teachers</w:t>
       </w:r>
     </w:p>
     <w:p>
@@ -11725,7 +11725,15 @@
                 <w:i w:val="0"/>
                 <w:sz w:val="19"/>
               </w:rPr>
-              <w:t>Not recorded in this plan.</w:t>
+              <w:t>Recorded for Lessons 1–13</w:t>
+            </w:r>
+            <w:r>
+              <w:rPr>
+                <w:b w:val="0"/>
+                <w:i w:val="0"/>
+                <w:sz w:val="19"/>
+              </w:rPr>
+              <w:t xml:space="preserve"> (about 1:23–2:17).</w:t>
             </w:r>
           </w:p>
         </w:tc>
@@ -17174,15 +17182,15 @@
                 <w:i w:val="0"/>
                 <w:sz w:val="19"/>
               </w:rPr>
-              <w:t>Target length:</w:t>
-            </w:r>
-            <w:r>
-              <w:rPr>
-                <w:b w:val="0"/>
-                <w:i w:val="0"/>
-                <w:sz w:val="19"/>
-              </w:rPr>
-              <w:t xml:space="preserve"> about 2:10. </w:t>
+              <w:t>Length:</w:t>
+            </w:r>
+            <w:r>
+              <w:rPr>
+                <w:b w:val="0"/>
+                <w:i w:val="0"/>
+                <w:sz w:val="19"/>
+              </w:rPr>
+              <w:t xml:space="preserve"> 1:37. </w:t>
             </w:r>
             <w:r>
               <w:rPr>
@@ -18477,15 +18485,15 @@
                 <w:i w:val="0"/>
                 <w:sz w:val="19"/>
               </w:rPr>
-              <w:t>Target length:</w:t>
-            </w:r>
-            <w:r>
-              <w:rPr>
-                <w:b w:val="0"/>
-                <w:i w:val="0"/>
-                <w:sz w:val="19"/>
-              </w:rPr>
-              <w:t xml:space="preserve"> about 2:15. </w:t>
+              <w:t>Length:</w:t>
+            </w:r>
+            <w:r>
+              <w:rPr>
+                <w:b w:val="0"/>
+                <w:i w:val="0"/>
+                <w:sz w:val="19"/>
+              </w:rPr>
+              <w:t xml:space="preserve"> 1:39. </w:t>
             </w:r>
             <w:r>
               <w:rPr>
@@ -19964,15 +19972,15 @@
                 <w:i w:val="0"/>
                 <w:sz w:val="19"/>
               </w:rPr>
-              <w:t>Target length:</w:t>
-            </w:r>
-            <w:r>
-              <w:rPr>
-                <w:b w:val="0"/>
-                <w:i w:val="0"/>
-                <w:sz w:val="19"/>
-              </w:rPr>
-              <w:t xml:space="preserve"> about 2:10. </w:t>
+              <w:t>Length:</w:t>
+            </w:r>
+            <w:r>
+              <w:rPr>
+                <w:b w:val="0"/>
+                <w:i w:val="0"/>
+                <w:sz w:val="19"/>
+              </w:rPr>
+              <w:t xml:space="preserve"> 1:23. </w:t>
             </w:r>
             <w:r>
               <w:rPr>
@@ -21499,15 +21507,15 @@
                 <w:i w:val="0"/>
                 <w:sz w:val="19"/>
               </w:rPr>
-              <w:t>Target length:</w:t>
-            </w:r>
-            <w:r>
-              <w:rPr>
-                <w:b w:val="0"/>
-                <w:i w:val="0"/>
-                <w:sz w:val="19"/>
-              </w:rPr>
-              <w:t xml:space="preserve"> about 2:15. </w:t>
+              <w:t>Length:</w:t>
+            </w:r>
+            <w:r>
+              <w:rPr>
+                <w:b w:val="0"/>
+                <w:i w:val="0"/>
+                <w:sz w:val="19"/>
+              </w:rPr>
+              <w:t xml:space="preserve"> 1:48. </w:t>
             </w:r>
             <w:r>
               <w:rPr>
@@ -22890,15 +22898,15 @@
                 <w:i w:val="0"/>
                 <w:sz w:val="19"/>
               </w:rPr>
-              <w:t>Target length:</w:t>
-            </w:r>
-            <w:r>
-              <w:rPr>
-                <w:b w:val="0"/>
-                <w:i w:val="0"/>
-                <w:sz w:val="19"/>
-              </w:rPr>
-              <w:t xml:space="preserve"> about 2:20. </w:t>
+              <w:t>Length:</w:t>
+            </w:r>
+            <w:r>
+              <w:rPr>
+                <w:b w:val="0"/>
+                <w:i w:val="0"/>
+                <w:sz w:val="19"/>
+              </w:rPr>
+              <w:t xml:space="preserve"> 1:43. </w:t>
             </w:r>
             <w:r>
               <w:rPr>
@@ -24305,15 +24313,15 @@
                 <w:i w:val="0"/>
                 <w:sz w:val="19"/>
               </w:rPr>
-              <w:t>Target length:</w:t>
-            </w:r>
-            <w:r>
-              <w:rPr>
-                <w:b w:val="0"/>
-                <w:i w:val="0"/>
-                <w:sz w:val="19"/>
-              </w:rPr>
-              <w:t xml:space="preserve"> about 2:25. </w:t>
+              <w:t>Length:</w:t>
+            </w:r>
+            <w:r>
+              <w:rPr>
+                <w:b w:val="0"/>
+                <w:i w:val="0"/>
+                <w:sz w:val="19"/>
+              </w:rPr>
+              <w:t xml:space="preserve"> 1:41. </w:t>
             </w:r>
             <w:r>
               <w:rPr>
@@ -25600,15 +25608,15 @@
                 <w:i w:val="0"/>
                 <w:sz w:val="19"/>
               </w:rPr>
-              <w:t>Target length:</w:t>
-            </w:r>
-            <w:r>
-              <w:rPr>
-                <w:b w:val="0"/>
-                <w:i w:val="0"/>
-                <w:sz w:val="19"/>
-              </w:rPr>
-              <w:t xml:space="preserve"> about 2:10. </w:t>
+              <w:t>Length:</w:t>
+            </w:r>
+            <w:r>
+              <w:rPr>
+                <w:b w:val="0"/>
+                <w:i w:val="0"/>
+                <w:sz w:val="19"/>
+              </w:rPr>
+              <w:t xml:space="preserve"> 1:30. </w:t>
             </w:r>
             <w:r>
               <w:rPr>
@@ -26931,15 +26939,15 @@
                 <w:i w:val="0"/>
                 <w:sz w:val="19"/>
               </w:rPr>
-              <w:t>Target length:</w:t>
-            </w:r>
-            <w:r>
-              <w:rPr>
-                <w:b w:val="0"/>
-                <w:i w:val="0"/>
-                <w:sz w:val="19"/>
-              </w:rPr>
-              <w:t xml:space="preserve"> about 2:20. </w:t>
+              <w:t>Length:</w:t>
+            </w:r>
+            <w:r>
+              <w:rPr>
+                <w:b w:val="0"/>
+                <w:i w:val="0"/>
+                <w:sz w:val="19"/>
+              </w:rPr>
+              <w:t xml:space="preserve"> 1:43. </w:t>
             </w:r>
             <w:r>
               <w:rPr>
@@ -28266,15 +28274,15 @@
                 <w:i w:val="0"/>
                 <w:sz w:val="19"/>
               </w:rPr>
-              <w:t>Target length:</w:t>
-            </w:r>
-            <w:r>
-              <w:rPr>
-                <w:b w:val="0"/>
-                <w:i w:val="0"/>
-                <w:sz w:val="19"/>
-              </w:rPr>
-              <w:t xml:space="preserve"> about 2:20. </w:t>
+              <w:t>Length:</w:t>
+            </w:r>
+            <w:r>
+              <w:rPr>
+                <w:b w:val="0"/>
+                <w:i w:val="0"/>
+                <w:sz w:val="19"/>
+              </w:rPr>
+              <w:t xml:space="preserve"> 1:50. </w:t>
             </w:r>
             <w:r>
               <w:rPr>
@@ -29761,15 +29769,15 @@
                 <w:i w:val="0"/>
                 <w:sz w:val="19"/>
               </w:rPr>
-              <w:t>Target length:</w:t>
-            </w:r>
-            <w:r>
-              <w:rPr>
-                <w:b w:val="0"/>
-                <w:i w:val="0"/>
-                <w:sz w:val="19"/>
-              </w:rPr>
-              <w:t xml:space="preserve"> about 2:30. </w:t>
+              <w:t>Length:</w:t>
+            </w:r>
+            <w:r>
+              <w:rPr>
+                <w:b w:val="0"/>
+                <w:i w:val="0"/>
+                <w:sz w:val="19"/>
+              </w:rPr>
+              <w:t xml:space="preserve"> 2:11. </w:t>
             </w:r>
             <w:r>
               <w:rPr>
@@ -31144,15 +31152,15 @@
                 <w:i w:val="0"/>
                 <w:sz w:val="19"/>
               </w:rPr>
-              <w:t>Target length:</w:t>
-            </w:r>
-            <w:r>
-              <w:rPr>
-                <w:b w:val="0"/>
-                <w:i w:val="0"/>
-                <w:sz w:val="19"/>
-              </w:rPr>
-              <w:t xml:space="preserve"> about 2:30. </w:t>
+              <w:t>Length:</w:t>
+            </w:r>
+            <w:r>
+              <w:rPr>
+                <w:b w:val="0"/>
+                <w:i w:val="0"/>
+                <w:sz w:val="19"/>
+              </w:rPr>
+              <w:t xml:space="preserve"> 2:02. </w:t>
             </w:r>
             <w:r>
               <w:rPr>
@@ -32631,15 +32639,15 @@
                 <w:i w:val="0"/>
                 <w:sz w:val="19"/>
               </w:rPr>
-              <w:t>Target length:</w:t>
-            </w:r>
-            <w:r>
-              <w:rPr>
-                <w:b w:val="0"/>
-                <w:i w:val="0"/>
-                <w:sz w:val="19"/>
-              </w:rPr>
-              <w:t xml:space="preserve"> about 2:35. </w:t>
+              <w:t>Length:</w:t>
+            </w:r>
+            <w:r>
+              <w:rPr>
+                <w:b w:val="0"/>
+                <w:i w:val="0"/>
+                <w:sz w:val="19"/>
+              </w:rPr>
+              <w:t xml:space="preserve"> 2:17. </w:t>
             </w:r>
             <w:r>
               <w:rPr>
@@ -33894,15 +33902,15 @@
                 <w:i w:val="0"/>
                 <w:sz w:val="19"/>
               </w:rPr>
-              <w:t>Target length:</w:t>
-            </w:r>
-            <w:r>
-              <w:rPr>
-                <w:b w:val="0"/>
-                <w:i w:val="0"/>
-                <w:sz w:val="19"/>
-              </w:rPr>
-              <w:t xml:space="preserve"> about 2:20. </w:t>
+              <w:t>Length:</w:t>
+            </w:r>
+            <w:r>
+              <w:rPr>
+                <w:b w:val="0"/>
+                <w:i w:val="0"/>
+                <w:sz w:val="19"/>
+              </w:rPr>
+              <w:t xml:space="preserve"> 1:47. </w:t>
             </w:r>
             <w:r>
               <w:rPr>

</xml_diff>